<commit_message>
Episode 1 prompts V9 (fixed): Egyptian stylized dance, soldier imitates the dancers, dance-importance sources
Co-Authored-By: Claude Sonnet 5.5 <noreply@anthropic.com>
Claude-Session: https://claude.ai/code/session_01S29WeDgsXUpbHNWdisiPFj
</commit_message>
<xml_diff>
--- a/The_Last_Day_of_Ancient_Egypt_Ep1_FLOW_PROMPTS_V9_FINAL.docx
+++ b/The_Last_Day_of_Ancient_Egypt_Ep1_FLOW_PROMPTS_V9_FINAL.docx
@@ -2299,7 +2299,7 @@
           <w:sz w:val="26"/>
           <w:szCs w:val="26"/>
         </w:rPr>
-        <w:t xml:space="preserve">SHOT 23 — No recorded wedding dance   [new]</w:t>
+        <w:t xml:space="preserve">SHOT 23 — Egyptian banquet dance, then improvisation   [new]</w:t>
       </w:r>
     </w:p>
     <w:p>
@@ -2350,7 +2350,7 @@
         <w:spacing w:after="80"/>
       </w:pPr>
       <w:r>
-        <w:t>VOICE/ACTING RULE: the narrator/voice-over is the only source of spoken words; it is a voice only, never a person or character on screen. No on-screen character speaks, no character lip-syncs, no speech-like mouth movement occurs, and no character mouths words. Characters communicate through facial expressions and body gestures only. Natural nonverbal sounds are allowed only where this original prompt already calls for them, and they must contain no words. Attached reference images, in order: the Egyptian wedding guests, the Roman soldiers, the wedding courtyard. 2D hand-drawn simplified cartoon with complete natural arms, hands, legs and feet in the exact style of the reference images: thin black outlines, large expressive heads, complete natural cartoon arms and hands, flat warm colors, playful documentary-comedy tone, 16:9. Characters, identical in every frame: the guests: use the exact approved Egyptian Guests reference. Preserve their established ancient-Egyptian hair/wig styling, faces, white linen garments, blue-and-gold collars, gold accessories/headwear, proportions, and color palette. Do not introduce modern hairstyles or generic characters. the Roman soldiers: use the exact approved Roman Soldier reference; preserve the red-crested helmets, silver/bronze armor, red capes, red rectangular shields with the established gold emblem, spears, faces, proportions, and complete simplified cartoon anatomy and approved proportions. Setting: sunny daytime wedding courtyard in ancient Alexandria, sandstone columns with painted blue-and-gold bands, long tables with white cloths and clay jars, orange cloth awnings, and a tall wooden entrance gate at the back-center that opens onto the street. Lighting: warm bright afternoon sunlight, soft shadows, rich saturated colors. ACTION TIMELINE (8 seconds): 0–2.5 s: a guest plays a reed flute and another beats a frame drum; the dancers start up while a Roman soldier watches from the edge with his arms crossed. 2.5–5.5 s: every dancer does a different move: one spins, one hops, one sways, all clashing; the soldier raises one eyebrow. 5.5–8 s: the dancers notice each other, shrug and keep going happily; the soldier stiffly taps one foot, out of rhythm. Camera: locked-off and perfectly still, eye-level medium-wide shot, the dancers fully visible from feet to heads (NOT a feet close-up), the soldier at the edge of the frame; the framing never changes (no tilt, pan, zoom or rising camera). Audio: voice-over narration only (a voice, never shown on screen; no narrator character appears): a British male voice, warm and dry, begins speaking within half a second and says: “Banquet paintings show musicians and dancers. A wedding dance? Unrecorded. We improvised.” The line takes about 4.8 seconds; leave the last second free of speech so the moment can land. Music: light ancient-Mediterranean wedding music (frame drums, reed flute, plucked strings), same theme in every clip, low under the voice. Sound effects: flute, frame drum, dancing feet on stone, clapping and natural cheerful laughter without any words, one stiff armor tap, timed to the action. Ambience: light courtyard ambience: clinking cups, footsteps on stone, a soft breeze, no words. Final reminder: no character says any word; only the voice-over narration speaks (voice only, nobody on screen is the narrator). Natural laughs, gasps and sighs are fine. No text, captions or logos in the frame.</w:t>
+        <w:t>VOICE/ACTING RULE: the narrator/voice-over is the only source of spoken words; it is a voice only, never a person or character on screen. No on-screen character speaks, no character lip-syncs, no speech-like mouth movement occurs, and no character mouths words. Characters communicate through facial expressions and body gestures only. Natural nonverbal sounds are allowed only where this original prompt already calls for them, and they must contain no words. Attached reference images, in order: the Egyptian wedding guests, the Roman soldiers, the wedding courtyard. 2D hand-drawn simplified cartoon with complete natural arms, hands, legs and feet in the exact style of the reference images: thin black outlines, large expressive heads, complete natural cartoon arms and hands, flat warm colors, playful documentary-comedy tone, 16:9. Characters, identical in every frame: the guests: use the exact approved Egyptian Guests reference. Preserve their established ancient-Egyptian hair/wig styling, faces, white linen garments, blue-and-gold collars, gold accessories/headwear, proportions, and color palette. Do not introduce modern hairstyles or generic characters. the musicians: guests in white linen playing harp, frame drum and reed flute. the Roman soldiers: use the exact approved Roman Soldier reference; preserve the red-crested helmets, silver/bronze armor, red capes, red rectangular shields with the established gold emblem, spears, faces, proportions, and complete simplified cartoon anatomy and approved proportions. Setting: sunny daytime wedding courtyard in ancient Alexandria, sandstone columns with painted blue-and-gold bands, long tables with white cloths and clay jars, orange cloth awnings, and a tall wooden entrance gate at the back-center that opens onto the street. Lighting: warm bright afternoon sunlight, soft shadows, rich saturated colors. ACTION TIMELINE (8 seconds): 0–2.5 s: the musicians sit on the ground at the edge of the courtyard playing a harp, a double flute and a frame drum while two dancers perform a stylized ancient-Egyptian dance in graceful profile poses, one arm raised high and one arm forward, stepping sideways in rhythm, with the guests watching admiringly and clapping softly; a Roman soldier watches from the edge with his arms crossed. 2.5–5.5 s: more dancers join and every one of them does a different move: one spins, one hops, one sways, all clashing with the graceful dancers; the soldier raises one eyebrow. 5.5–8 s: the dancers notice each other, shrug and keep going happily; the soldier stiffly taps one foot, out of rhythm. Camera: locked-off and perfectly still, eye-level medium-wide shot, the dancers fully visible from feet to heads (NOT a feet close-up), the musicians seated at the side and the soldier at the edge of the frame; the framing never changes (no tilt, pan, zoom or rising camera). Audio: voice-over narration only (a voice, never shown on screen; no narrator character appears): a British male voice, warm and dry, begins speaking within half a second and says: “Banquet paintings show musicians and dancers. A wedding dance? Unrecorded. We improvised.” The line takes about 4.8 seconds; leave the last second free of speech so the moment can land. Music: light ancient-Egyptian-style wedding music (harp, double flute, frame drums and handclaps), same theme in every clip, low under the voice. Sound effects: harp, double flute, frame drum, handclaps, dancing feet on stone, natural cheerful laughter without any words, one stiff armor tap, timed to the action. Ambience: light courtyard ambience: clinking cups, footsteps on stone, a soft breeze, no words. Final reminder: no character says any word; only the voice-over narration speaks (voice only, nobody on screen is the narrator). Natural laughs, gasps and sighs are fine. No text, captions or logos in the frame.</w:t>
       </w:r>
     </w:p>
     <w:p>
@@ -2418,7 +2418,7 @@
         <w:spacing w:after="80"/>
       </w:pPr>
       <w:r>
-        <w:t>VOICE/ACTING RULE: the narrator/voice-over is the only source of spoken words; it is a voice only, never a person or character on screen. No on-screen character speaks, no character lip-syncs, no speech-like mouth movement occurs, and no character mouths words. Characters communicate through facial expressions and body gestures only. Natural nonverbal sounds are allowed only where this original prompt already calls for them, and they must contain no words. Attached reference images, in order: the Roman soldiers, the Egyptian wedding guests, the wedding courtyard. 2D hand-drawn simplified cartoon with complete natural arms, hands, legs and feet in the exact style of the reference images: thin black outlines, large expressive heads, complete natural cartoon arms and hands, flat warm colors, playful documentary-comedy tone, 16:9. Characters, identical in every frame: the guests: use the exact approved Egyptian Guests reference. Preserve their established ancient-Egyptian hair/wig styling, faces, white linen garments, blue-and-gold collars, gold accessories/headwear, proportions, and color palette. Do not introduce modern hairstyles or generic characters. the Roman soldiers: use the exact approved Roman Soldier reference; preserve the red-crested helmets, silver/bronze armor, red capes, red rectangular shields with the established gold emblem, spears, faces, proportions, and complete simplified cartoon anatomy and approved proportions. Setting: sunny daytime wedding courtyard in ancient Alexandria, sandstone columns with painted blue-and-gold bands, long tables with white cloths and clay jars, orange cloth awnings, and a tall wooden entrance gate at the back-center that opens onto the street. Lighting: warm bright afternoon sunlight, soft shadows, rich saturated colors. ACTION TIMELINE (8 seconds): 0–2.5 s: Egyptian guests dance in the courtyard. 2.5–5.5 s: one Roman soldier steps awkwardly onto the dance floor, stiff as a board; the guests freeze and stare. 5.5–8 s: one guest begins to copy his stiff step and the others hesitate, then join in. Camera: locked-off and perfectly still, eye-level wide shot; the framing never changes (no tilt, pan, zoom or rising camera). Audio: voice-over narration only (a voice, never shown on screen; no narrator character appears): a British male voice, warm and dry, begins speaking within half a second and says: “That soldier joined the dance. Senbi tried to keep up.” The line takes about 4.0 seconds; leave the last second free of speech so the moment can land. Music: playful comic percussion over the wedding rhythm, low under the voice. Sound effects: shield tap blending into the rhythm, clapping, timed to the action. Ambience: light courtyard ambience: clinking cups, footsteps on stone, a soft breeze, no words. Final reminder: no character says any word; only the voice-over narration speaks (voice only, nobody on screen is the narrator). Natural laughs, gasps and sighs are fine. No text, captions or logos in the frame.</w:t>
+        <w:t>VOICE/ACTING RULE: the narrator/voice-over is the only source of spoken words; it is a voice only, never a person or character on screen. No on-screen character speaks, no character lip-syncs, no speech-like mouth movement occurs, and no character mouths words. Characters communicate through facial expressions and body gestures only. Natural nonverbal sounds are allowed only where this original prompt already calls for them, and they must contain no words. Attached reference images, in order: the Roman soldiers, the Egyptian wedding guests, the wedding courtyard. 2D hand-drawn simplified cartoon with complete natural arms, hands, legs and feet in the exact style of the reference images: thin black outlines, large expressive heads, complete natural cartoon arms and hands, flat warm colors, playful documentary-comedy tone, 16:9. Characters, identical in every frame: the guests: use the exact approved Egyptian Guests reference. Preserve their established ancient-Egyptian hair/wig styling, faces, white linen garments, blue-and-gold collars, gold accessories/headwear, proportions, and color palette. Do not introduce modern hairstyles or generic characters. the musicians: guests in white linen playing harp, frame drum and reed flute. the Roman soldiers: use the exact approved Roman Soldier reference; preserve the red-crested helmets, silver/bronze armor, red capes, red rectangular shields with the established gold emblem, spears, faces, proportions, and complete simplified cartoon anatomy and approved proportions. Setting: sunny daytime wedding courtyard in ancient Alexandria, sandstone columns with painted blue-and-gold bands, long tables with white cloths and clay jars, orange cloth awnings, and a tall wooden entrance gate at the back-center that opens onto the street. Lighting: warm bright afternoon sunlight, soft shadows, rich saturated colors. ACTION TIMELINE (8 seconds): 0–2.5 s: two Egyptian women in white linen dance a stylized ancient-Egyptian dance in the middle of the courtyard in graceful profile poses, one arm raised high and one arm forward, stepping sideways in rhythm to the harp, double flute and frame drum of the musicians seated at the side, while the guests watch with admiring respect and clap softly. 2.5–5.5 s: one Roman soldier steps forward from the edge, stands right behind the two women and tries to copy their poses very seriously, half a beat late and stiff as a board, one arm raised awkwardly; the guests freeze and stare. 5.5–8 s: one guest begins to copy the soldier's stiff step and the others hesitate, then join in, while the two women keep dancing gracefully in front. Camera: locked-off and perfectly still, eye-level wide shot of the courtyard with the two dancers in the center, the soldier behind them, the guests around and the musicians seated at the side; the framing never changes (no tilt, pan, zoom or rising camera). Audio: voice-over narration only (a voice, never shown on screen; no narrator character appears): a British male voice, warm and dry, begins speaking within half a second and says: “That soldier joined the dance. Senbi tried to keep up.” The line takes about 4.0 seconds; leave the last second free of speech so the moment can land. Music: light ancient-Egyptian-style wedding music (harp, double flute, frame drums and handclaps) with a playful comic accent, low under the voice. Sound effects: handclaps, dancing feet on stone, a soft shield tap blending into the rhythm, natural cheerful laughter without any words, timed to the action. Ambience: light courtyard ambience: clinking cups, footsteps on stone, a soft breeze, no words. Final reminder: no character says any word; only the voice-over narration speaks (voice only, nobody on screen is the narrator). Natural laughs, gasps and sighs are fine. No text, captions or logos in the frame.</w:t>
       </w:r>
     </w:p>
     <w:p>
@@ -5196,6 +5196,40 @@
           <w:sz w:val="21"/>
           <w:szCs w:val="21"/>
         </w:rPr>
+        <w:t xml:space="preserve">Shots 23, 24:  </w:t>
+      </w:r>
+      <w:r>
+        <w:rPr>
+          <w:rFonts w:ascii="Arial" w:cs="Arial" w:eastAsia="Arial" w:hAnsi="Arial"/>
+          <w:sz w:val="21"/>
+          <w:szCs w:val="21"/>
+        </w:rPr>
+        <w:t xml:space="preserve">Dance was important in ancient Egyptian life: banquets, festivals, funerary and religious ritual (the dancing in these shots is stylized and illustrative) | OK  National Geographic https://www.nationalgeographic.com/history/article/dance-ancient-egyptians | Wikipedia, Dance in ancient Egypt https://en.wikipedia.org/wiki/Dance_in_ancient_Egypt | ARCE, Nourishment for the Heart https://arce-nc.org/green.htm | Tomb of Nakht banquet with female musicians (harp, lute, double flute) https://www.metmuseum.org/art/collection/search/548576 | Dancing for the Dead: muu dancers https://revistas.ucm.es/index.php/EIKO/article/view/78355 | Hathor, goddess of music and dance https://egypt.swan.ac.uk/?p=129 | Banquet music in the New Kingdom https://www.encyclopedia.com/humanities/culture-magazines/banquet-music-during-new-kingdom</w:t>
+      </w:r>
+    </w:p>
+    <w:p>
+      <w:pPr>
+        <w:spacing w:after="40" w:before="0"/>
+      </w:pPr>
+      <w:r>
+        <w:rPr>
+          <w:rFonts w:ascii="Arial" w:cs="Arial" w:eastAsia="Arial" w:hAnsi="Arial"/>
+          <w:b/>
+          <w:bCs/>
+          <w:color w:val="888888"/>
+          <w:sz w:val="21"/>
+          <w:szCs w:val="21"/>
+        </w:rPr>
+        <w:t xml:space="preserve">10  </w:t>
+      </w:r>
+      <w:r>
+        <w:rPr>
+          <w:rFonts w:ascii="Arial" w:cs="Arial" w:eastAsia="Arial" w:hAnsi="Arial"/>
+          <w:b/>
+          <w:bCs/>
+          <w:sz w:val="21"/>
+          <w:szCs w:val="21"/>
+        </w:rPr>
         <w:t xml:space="preserve">Shots 14, 15:  </w:t>
       </w:r>
       <w:r>
@@ -5220,7 +5254,7 @@
           <w:sz w:val="21"/>
           <w:szCs w:val="21"/>
         </w:rPr>
-        <w:t xml:space="preserve">10  </w:t>
+        <w:t xml:space="preserve">11  </w:t>
       </w:r>
       <w:r>
         <w:rPr>
@@ -5517,6 +5551,210 @@
           <w:sz w:val="21"/>
           <w:szCs w:val="21"/>
         </w:rPr>
+        <w:t xml:space="preserve">Tomb of Nakht (TT52) banquet scene:  </w:t>
+      </w:r>
+      <w:r>
+        <w:rPr>
+          <w:rFonts w:ascii="Arial" w:cs="Arial" w:eastAsia="Arial" w:hAnsi="Arial"/>
+          <w:sz w:val="21"/>
+          <w:szCs w:val="21"/>
+        </w:rPr>
+        <w:t xml:space="preserve">three women playing double flute, harp and lute; the lute player dances while playing | OK  https://www.metmuseum.org/art/collection/search/548576 | https://en.wikipedia.org/wiki/TT52  (the claim that musicians were high-status professionals was not confirmed)</w:t>
+      </w:r>
+    </w:p>
+    <w:p>
+      <w:pPr>
+        <w:spacing w:after="40" w:before="0"/>
+      </w:pPr>
+      <w:r>
+        <w:rPr>
+          <w:rFonts w:ascii="Arial" w:cs="Arial" w:eastAsia="Arial" w:hAnsi="Arial"/>
+          <w:b/>
+          <w:bCs/>
+          <w:color w:val="888888"/>
+          <w:sz w:val="21"/>
+          <w:szCs w:val="21"/>
+        </w:rPr>
+        <w:t xml:space="preserve">09  </w:t>
+      </w:r>
+      <w:r>
+        <w:rPr>
+          <w:rFonts w:ascii="Arial" w:cs="Arial" w:eastAsia="Arial" w:hAnsi="Arial"/>
+          <w:b/>
+          <w:bCs/>
+          <w:sz w:val="21"/>
+          <w:szCs w:val="21"/>
+        </w:rPr>
+        <w:t xml:space="preserve">Muu dancers:  </w:t>
+      </w:r>
+      <w:r>
+        <w:rPr>
+          <w:rFonts w:ascii="Arial" w:cs="Arial" w:eastAsia="Arial" w:hAnsi="Arial"/>
+          <w:sz w:val="21"/>
+          <w:szCs w:val="21"/>
+        </w:rPr>
+        <w:t xml:space="preserve">male funerary dancers who greeted the funeral procession | OK  shown in Middle and New Kingdom tombs, mostly 18th dynasty: https://revistas.ucm.es/index.php/EIKO/article/view/78355  (the Old Kingdom date you sent was not confirmed)</w:t>
+      </w:r>
+    </w:p>
+    <w:p>
+      <w:pPr>
+        <w:spacing w:after="40" w:before="0"/>
+      </w:pPr>
+      <w:r>
+        <w:rPr>
+          <w:rFonts w:ascii="Arial" w:cs="Arial" w:eastAsia="Arial" w:hAnsi="Arial"/>
+          <w:b/>
+          <w:bCs/>
+          <w:color w:val="888888"/>
+          <w:sz w:val="21"/>
+          <w:szCs w:val="21"/>
+        </w:rPr>
+        <w:t xml:space="preserve">10  </w:t>
+      </w:r>
+      <w:r>
+        <w:rPr>
+          <w:rFonts w:ascii="Arial" w:cs="Arial" w:eastAsia="Arial" w:hAnsi="Arial"/>
+          <w:b/>
+          <w:bCs/>
+          <w:sz w:val="21"/>
+          <w:szCs w:val="21"/>
+        </w:rPr>
+        <w:t xml:space="preserve">Irena Lexova, Ancient Egyptian Dances (Dover, 2000):  </w:t>
+      </w:r>
+      <w:r>
+        <w:rPr>
+          <w:rFonts w:ascii="Arial" w:cs="Arial" w:eastAsia="Arial" w:hAnsi="Arial"/>
+          <w:sz w:val="21"/>
+          <w:szCs w:val="21"/>
+        </w:rPr>
+        <w:t xml:space="preserve">classification of dances | OK, but the book lists about 11 types (e.g. funeral, religious, war, dramatic, gymnastic), not the 4 you were told  https://en.wikipedia.org/wiki/Dance_in_ancient_Egypt</w:t>
+      </w:r>
+    </w:p>
+    <w:p>
+      <w:pPr>
+        <w:spacing w:after="40" w:before="0"/>
+      </w:pPr>
+      <w:r>
+        <w:rPr>
+          <w:rFonts w:ascii="Arial" w:cs="Arial" w:eastAsia="Arial" w:hAnsi="Arial"/>
+          <w:b/>
+          <w:bCs/>
+          <w:color w:val="888888"/>
+          <w:sz w:val="21"/>
+          <w:szCs w:val="21"/>
+        </w:rPr>
+        <w:t xml:space="preserve">11  </w:t>
+      </w:r>
+      <w:r>
+        <w:rPr>
+          <w:rFonts w:ascii="Arial" w:cs="Arial" w:eastAsia="Arial" w:hAnsi="Arial"/>
+          <w:b/>
+          <w:bCs/>
+          <w:sz w:val="21"/>
+          <w:szCs w:val="21"/>
+        </w:rPr>
+        <w:t xml:space="preserve">Dendera and Hathor; sistrum:  </w:t>
+      </w:r>
+      <w:r>
+        <w:rPr>
+          <w:rFonts w:ascii="Arial" w:cs="Arial" w:eastAsia="Arial" w:hAnsi="Arial"/>
+          <w:sz w:val="21"/>
+          <w:szCs w:val="21"/>
+        </w:rPr>
+        <w:t xml:space="preserve">Hathor as goddess of music, dance and joy; the sistrum in her cult | OK  https://egypt.swan.ac.uk/?p=129 | https://www.pyramidsland.com/blog/sistrum  ("music to appease the gods’ anger" not confirmed)</w:t>
+      </w:r>
+    </w:p>
+    <w:p>
+      <w:pPr>
+        <w:spacing w:after="40" w:before="0"/>
+      </w:pPr>
+      <w:r>
+        <w:rPr>
+          <w:rFonts w:ascii="Arial" w:cs="Arial" w:eastAsia="Arial" w:hAnsi="Arial"/>
+          <w:b/>
+          <w:bCs/>
+          <w:color w:val="888888"/>
+          <w:sz w:val="21"/>
+          <w:szCs w:val="21"/>
+        </w:rPr>
+        <w:t xml:space="preserve">12  </w:t>
+      </w:r>
+      <w:r>
+        <w:rPr>
+          <w:rFonts w:ascii="Arial" w:cs="Arial" w:eastAsia="Arial" w:hAnsi="Arial"/>
+          <w:b/>
+          <w:bCs/>
+          <w:sz w:val="21"/>
+          <w:szCs w:val="21"/>
+        </w:rPr>
+        <w:t xml:space="preserve">Plato, Laws II:  </w:t>
+      </w:r>
+      <w:r>
+        <w:rPr>
+          <w:rFonts w:ascii="Arial" w:cs="Arial" w:eastAsia="Arial" w:hAnsi="Arial"/>
+          <w:sz w:val="21"/>
+          <w:szCs w:val="21"/>
+        </w:rPr>
+        <w:t xml:space="preserve">Egyptians kept their music and arts unchanged | OK, but Plato credits the ancient chants to the goddess ISIS, not to "laws of Hathor"  https://www.ellopos.net/elpenor/greek-texts/ancient-greece/plato/plato-laws.asp?pg=38</w:t>
+      </w:r>
+    </w:p>
+    <w:p>
+      <w:pPr>
+        <w:spacing w:after="40" w:before="0"/>
+      </w:pPr>
+      <w:r>
+        <w:rPr>
+          <w:rFonts w:ascii="Arial" w:cs="Arial" w:eastAsia="Arial" w:hAnsi="Arial"/>
+          <w:b/>
+          <w:bCs/>
+          <w:color w:val="888888"/>
+          <w:sz w:val="21"/>
+          <w:szCs w:val="21"/>
+        </w:rPr>
+        <w:t xml:space="preserve">13  </w:t>
+      </w:r>
+      <w:r>
+        <w:rPr>
+          <w:rFonts w:ascii="Arial" w:cs="Arial" w:eastAsia="Arial" w:hAnsi="Arial"/>
+          <w:b/>
+          <w:bCs/>
+          <w:sz w:val="21"/>
+          <w:szCs w:val="21"/>
+        </w:rPr>
+        <w:t xml:space="preserve">Music to set the rhythm of work (WHE):  </w:t>
+      </w:r>
+      <w:r>
+        <w:rPr>
+          <w:rFonts w:ascii="Arial" w:cs="Arial" w:eastAsia="Arial" w:hAnsi="Arial"/>
+          <w:sz w:val="21"/>
+          <w:szCs w:val="21"/>
+        </w:rPr>
+        <w:t xml:space="preserve">work songs | CHECK  not confirmed in searches</w:t>
+      </w:r>
+    </w:p>
+    <w:p>
+      <w:pPr>
+        <w:spacing w:after="40" w:before="0"/>
+      </w:pPr>
+      <w:r>
+        <w:rPr>
+          <w:rFonts w:ascii="Arial" w:cs="Arial" w:eastAsia="Arial" w:hAnsi="Arial"/>
+          <w:b/>
+          <w:bCs/>
+          <w:color w:val="888888"/>
+          <w:sz w:val="21"/>
+          <w:szCs w:val="21"/>
+        </w:rPr>
+        <w:t xml:space="preserve">14  </w:t>
+      </w:r>
+      <w:r>
+        <w:rPr>
+          <w:rFonts w:ascii="Arial" w:cs="Arial" w:eastAsia="Arial" w:hAnsi="Arial"/>
+          <w:b/>
+          <w:bCs/>
+          <w:sz w:val="21"/>
+          <w:szCs w:val="21"/>
+        </w:rPr>
         <w:t xml:space="preserve">Scent cones, 2019 Amarna finds with myrrh:  </w:t>
       </w:r>
       <w:r>
@@ -5541,7 +5779,7 @@
           <w:sz w:val="21"/>
           <w:szCs w:val="21"/>
         </w:rPr>
-        <w:t xml:space="preserve">09  </w:t>
+        <w:t xml:space="preserve">15  </w:t>
       </w:r>
       <w:r>
         <w:rPr>
@@ -5575,7 +5813,7 @@
           <w:sz w:val="21"/>
           <w:szCs w:val="21"/>
         </w:rPr>
-        <w:t xml:space="preserve">10  </w:t>
+        <w:t xml:space="preserve">16  </w:t>
       </w:r>
       <w:r>
         <w:rPr>
@@ -5609,7 +5847,7 @@
           <w:sz w:val="21"/>
           <w:szCs w:val="21"/>
         </w:rPr>
-        <w:t xml:space="preserve">11  </w:t>
+        <w:t xml:space="preserve">17  </w:t>
       </w:r>
       <w:r>
         <w:rPr>
@@ -5643,7 +5881,7 @@
           <w:sz w:val="21"/>
           <w:szCs w:val="21"/>
         </w:rPr>
-        <w:t xml:space="preserve">12  </w:t>
+        <w:t xml:space="preserve">18  </w:t>
       </w:r>
       <w:r>
         <w:rPr>
@@ -5677,7 +5915,7 @@
           <w:sz w:val="21"/>
           <w:szCs w:val="21"/>
         </w:rPr>
-        <w:t xml:space="preserve">13  </w:t>
+        <w:t xml:space="preserve">19  </w:t>
       </w:r>
       <w:r>
         <w:rPr>
@@ -5711,7 +5949,7 @@
           <w:sz w:val="21"/>
           <w:szCs w:val="21"/>
         </w:rPr>
-        <w:t xml:space="preserve">14  </w:t>
+        <w:t xml:space="preserve">20  </w:t>
       </w:r>
       <w:r>
         <w:rPr>
@@ -5745,7 +5983,7 @@
           <w:sz w:val="21"/>
           <w:szCs w:val="21"/>
         </w:rPr>
-        <w:t xml:space="preserve">15  </w:t>
+        <w:t xml:space="preserve">21  </w:t>
       </w:r>
       <w:r>
         <w:rPr>
@@ -5779,7 +6017,7 @@
           <w:sz w:val="21"/>
           <w:szCs w:val="21"/>
         </w:rPr>
-        <w:t xml:space="preserve">16  </w:t>
+        <w:t xml:space="preserve">22  </w:t>
       </w:r>
       <w:r>
         <w:rPr>

</xml_diff>